<commit_message>
Updates for 5/7/26 submission. docs/User Manual.docx now indcludes additional detail regarding hardware setup. Added docs/GUI Screenshots with Terminal Outputs.png.
</commit_message>
<xml_diff>
--- a/docs/User Manual.docx
+++ b/docs/User Manual.docx
@@ -1,6 +1,6 @@
 
 <file path=word/document.xml><?xml version="1.0" encoding="utf-8"?>
-<w:document xmlns:wpc="http://schemas.microsoft.com/office/word/2010/wordprocessingCanvas" xmlns:cx="http://schemas.microsoft.com/office/drawing/2014/chartex" xmlns:cx1="http://schemas.microsoft.com/office/drawing/2015/9/8/chartex" xmlns:cx2="http://schemas.microsoft.com/office/drawing/2015/10/21/chartex" xmlns:cx3="http://schemas.microsoft.com/office/drawing/2016/5/9/chartex" xmlns:cx4="http://schemas.microsoft.com/office/drawing/2016/5/10/chartex" xmlns:cx5="http://schemas.microsoft.com/office/drawing/2016/5/11/chartex" xmlns:cx6="http://schemas.microsoft.com/office/drawing/2016/5/12/chartex" xmlns:cx7="http://schemas.microsoft.com/office/drawing/2016/5/13/chartex" xmlns:cx8="http://schemas.microsoft.com/office/drawing/2016/5/14/chartex" xmlns:mc="http://schemas.openxmlformats.org/markup-compatibility/2006" xmlns:aink="http://schemas.microsoft.com/office/drawing/2016/ink" xmlns:am3d="http://schemas.microsoft.com/office/drawing/2017/model3d" xmlns:o="urn:schemas-microsoft-com:office:office" xmlns:oel="http://schemas.microsoft.com/office/2019/extlst" xmlns:r="http://schemas.openxmlformats.org/officeDocument/2006/relationships" xmlns:m="http://schemas.openxmlformats.org/officeDocument/2006/math" xmlns:v="urn:schemas-microsoft-com:vml" xmlns:wp14="http://schemas.microsoft.com/office/word/2010/wordprocessingDrawing" xmlns:wp="http://schemas.openxmlformats.org/drawingml/2006/wordprocessingDrawing" xmlns:w10="urn:schemas-microsoft-com:office:word" xmlns:w="http://schemas.openxmlformats.org/wordprocessingml/2006/main" xmlns:w14="http://schemas.microsoft.com/office/word/2010/wordml" xmlns:w15="http://schemas.microsoft.com/office/word/2012/wordml" xmlns:w16cex="http://schemas.microsoft.com/office/word/2018/wordml/cex" xmlns:w16cid="http://schemas.microsoft.com/office/word/2016/wordml/cid" xmlns:w16="http://schemas.microsoft.com/office/word/2018/wordml" xmlns:w16sdtdh="http://schemas.microsoft.com/office/word/2020/wordml/sdtdatahash" xmlns:w16se="http://schemas.microsoft.com/office/word/2015/wordml/symex" xmlns:wpg="http://schemas.microsoft.com/office/word/2010/wordprocessingGroup" xmlns:wpi="http://schemas.microsoft.com/office/word/2010/wordprocessingInk" xmlns:wne="http://schemas.microsoft.com/office/word/2006/wordml" xmlns:wps="http://schemas.microsoft.com/office/word/2010/wordprocessingShape" mc:Ignorable="w14 w15 w16se w16cid w16 w16cex w16sdtdh wp14">
+<w:document xmlns:wpc="http://schemas.microsoft.com/office/word/2010/wordprocessingCanvas" xmlns:cx="http://schemas.microsoft.com/office/drawing/2014/chartex" xmlns:cx1="http://schemas.microsoft.com/office/drawing/2015/9/8/chartex" xmlns:cx2="http://schemas.microsoft.com/office/drawing/2015/10/21/chartex" xmlns:cx3="http://schemas.microsoft.com/office/drawing/2016/5/9/chartex" xmlns:cx4="http://schemas.microsoft.com/office/drawing/2016/5/10/chartex" xmlns:cx5="http://schemas.microsoft.com/office/drawing/2016/5/11/chartex" xmlns:cx6="http://schemas.microsoft.com/office/drawing/2016/5/12/chartex" xmlns:cx7="http://schemas.microsoft.com/office/drawing/2016/5/13/chartex" xmlns:cx8="http://schemas.microsoft.com/office/drawing/2016/5/14/chartex" xmlns:mc="http://schemas.openxmlformats.org/markup-compatibility/2006" xmlns:aink="http://schemas.microsoft.com/office/drawing/2016/ink" xmlns:am3d="http://schemas.microsoft.com/office/drawing/2017/model3d" xmlns:o="urn:schemas-microsoft-com:office:office" xmlns:oel="http://schemas.microsoft.com/office/2019/extlst" xmlns:r="http://schemas.openxmlformats.org/officeDocument/2006/relationships" xmlns:m="http://schemas.openxmlformats.org/officeDocument/2006/math" xmlns:v="urn:schemas-microsoft-com:vml" xmlns:wp14="http://schemas.microsoft.com/office/word/2010/wordprocessingDrawing" xmlns:wp="http://schemas.openxmlformats.org/drawingml/2006/wordprocessingDrawing" xmlns:w10="urn:schemas-microsoft-com:office:word" xmlns:w="http://schemas.openxmlformats.org/wordprocessingml/2006/main" xmlns:w14="http://schemas.microsoft.com/office/word/2010/wordml" xmlns:w15="http://schemas.microsoft.com/office/word/2012/wordml" xmlns:w16cex="http://schemas.microsoft.com/office/word/2018/wordml/cex" xmlns:w16cid="http://schemas.microsoft.com/office/word/2016/wordml/cid" xmlns:w16="http://schemas.microsoft.com/office/word/2018/wordml" xmlns:w16du="http://schemas.microsoft.com/office/word/2023/wordml/word16du" xmlns:w16sdtdh="http://schemas.microsoft.com/office/word/2020/wordml/sdtdatahash" xmlns:w16sdtfl="http://schemas.microsoft.com/office/word/2024/wordml/sdtformatlock" xmlns:w16se="http://schemas.microsoft.com/office/word/2015/wordml/symex" xmlns:wpg="http://schemas.microsoft.com/office/word/2010/wordprocessingGroup" xmlns:wpi="http://schemas.microsoft.com/office/word/2010/wordprocessingInk" xmlns:wne="http://schemas.microsoft.com/office/word/2006/wordml" xmlns:wps="http://schemas.microsoft.com/office/word/2010/wordprocessingShape" mc:Ignorable="w14 w15 w16se w16cid w16 w16cex w16sdtdh w16sdtfl w16du wp14">
   <w:body>
     <w:p>
       <w:r>
@@ -1556,7 +1556,34 @@
         <w:t>A custom printed circuit board (PCB) was created for this project, which is shown in Figure 1.</w:t>
       </w:r>
       <w:r>
-        <w:t xml:space="preserve"> Schematic and board files are included in the project design files, which were made in Autodesk EAGLE. Gerber files, which are sent to manufacturers to produce, in the form of a zip file is included in the project design files as well in case there is no access to the schematic and board file viewers. A complete connection overview is shown in Figure 2, where connections with the Arduino Mega 2560 Rev3, the 25-pin serial cable that conducts digital logic of the Med Associates Inc operant chamber products, and alligator clips that power the operant chamber are visible. </w:t>
+        <w:t xml:space="preserve"> Schematic and board files are included in the project design files, which were made </w:t>
+      </w:r>
+      <w:proofErr w:type="gramStart"/>
+      <w:r>
+        <w:t>in</w:t>
+      </w:r>
+      <w:proofErr w:type="gramEnd"/>
+      <w:r>
+        <w:t xml:space="preserve"> Autodesk EAGLE. Gerber files, which are sent to manufacturers to produce, in the form of a zip file </w:t>
+      </w:r>
+      <w:proofErr w:type="gramStart"/>
+      <w:r>
+        <w:t>is</w:t>
+      </w:r>
+      <w:proofErr w:type="gramEnd"/>
+      <w:r>
+        <w:t xml:space="preserve"> included in the project design files as well in case there is no access to the schematic and board file viewers. A complete connection overview is shown in Figure 2, where connections with the Arduino Mega 2560 Rev3, the 25-pin serial cable that conducts digital logic of the Med Associates Inc operant chamber products, and alligator clips that power the operant chamber are visible. </w:t>
+      </w:r>
+      <w:r>
+        <w:t xml:space="preserve">Note: an Arduino Uno Rev3 was used for the experiments presented in the accompanying paper; the setup for this board is </w:t>
+      </w:r>
+      <w:proofErr w:type="gramStart"/>
+      <w:r>
+        <w:t>identical</w:t>
+      </w:r>
+      <w:proofErr w:type="gramEnd"/>
+      <w:r>
+        <w:t xml:space="preserve"> the Mega, only with less pins.</w:t>
       </w:r>
     </w:p>
     <w:p>
@@ -1644,7 +1671,15 @@
         <w:t>. Connections not shown is a power cord that plugs into the black housing on the bottom of the board.</w:t>
       </w:r>
       <w:r>
-        <w:t xml:space="preserve"> The two squares of arrays are irrelevant to the performance of the proposed system and was included in the design for a different project.</w:t>
+        <w:t xml:space="preserve"> The two squares of arrays are irrelevant to the performance of the proposed system and </w:t>
+      </w:r>
+      <w:proofErr w:type="gramStart"/>
+      <w:r>
+        <w:t>was</w:t>
+      </w:r>
+      <w:proofErr w:type="gramEnd"/>
+      <w:r>
+        <w:t xml:space="preserve"> included in the design for a different project.</w:t>
       </w:r>
     </w:p>
     <w:p>
@@ -1657,9 +1692,9 @@
           <w:noProof/>
         </w:rPr>
         <w:drawing>
-          <wp:inline distT="0" distB="0" distL="0" distR="0" wp14:anchorId="5764A9D9" wp14:editId="1B110EF0">
-            <wp:extent cx="4351028" cy="2801474"/>
-            <wp:effectExtent l="0" t="0" r="0" b="0"/>
+          <wp:inline distT="0" distB="0" distL="0" distR="0" wp14:anchorId="5764A9D9" wp14:editId="36E79C31">
+            <wp:extent cx="4068206" cy="2619375"/>
+            <wp:effectExtent l="0" t="0" r="8890" b="0"/>
             <wp:docPr id="1277300555" name="Picture 5" descr="A circuit board with wires attached to it&#10;&#10;Description automatically generated"/>
             <wp:cNvGraphicFramePr>
               <a:graphicFrameLocks xmlns:a="http://schemas.openxmlformats.org/drawingml/2006/main" noChangeAspect="1"/>
@@ -1687,7 +1722,7 @@
                   <pic:spPr bwMode="auto">
                     <a:xfrm>
                       <a:off x="0" y="0"/>
-                      <a:ext cx="4386063" cy="2824032"/>
+                      <a:ext cx="4102444" cy="2641420"/>
                     </a:xfrm>
                     <a:prstGeom prst="rect">
                       <a:avLst/>
@@ -1959,10 +1994,1044 @@
     <w:p>
       <w:r>
         <w:tab/>
-        <w:t>[Thingies!]</w:t>
-      </w:r>
-    </w:p>
-    <w:p/>
+      </w:r>
+      <w:r>
+        <w:t xml:space="preserve">Table 1 </w:t>
+      </w:r>
+      <w:r>
+        <w:t>of</w:t>
+      </w:r>
+      <w:r>
+        <w:t xml:space="preserve"> the accompanying paper lists all Med Associates components </w:t>
+      </w:r>
+      <w:r>
+        <w:t xml:space="preserve">and their </w:t>
+      </w:r>
+      <w:r>
+        <w:t>functions</w:t>
+      </w:r>
+      <w:r>
+        <w:t xml:space="preserve"> </w:t>
+      </w:r>
+      <w:r>
+        <w:t xml:space="preserve">which were interfaced by the Arduino microcontroller. </w:t>
+      </w:r>
+      <w:r>
+        <w:t>Table 1 in this document, provides the channel and pin configuration for two of the experiments presented in the paper.</w:t>
+      </w:r>
+      <w:r>
+        <w:t xml:space="preserve"> </w:t>
+      </w:r>
+    </w:p>
+    <w:p>
+      <w:pPr>
+        <w:pStyle w:val="Caption"/>
+        <w:keepNext/>
+        <w:spacing w:after="120"/>
+      </w:pPr>
+      <w:r>
+        <w:t xml:space="preserve">Table </w:t>
+      </w:r>
+      <w:fldSimple w:instr=" SEQ Table \* ARABIC ">
+        <w:r>
+          <w:rPr>
+            <w:noProof/>
+          </w:rPr>
+          <w:t>1</w:t>
+        </w:r>
+      </w:fldSimple>
+      <w:r>
+        <w:t xml:space="preserve">: Channel and pin configuration for </w:t>
+      </w:r>
+      <w:r>
+        <w:t>2AFC behavioral experiments (initial training and SCS experiment from accompanying paper)</w:t>
+      </w:r>
+      <w:r>
+        <w:t xml:space="preserve">. </w:t>
+      </w:r>
+      <w:r>
+        <w:t xml:space="preserve">Variable names of the Arduino pins correspond to the code in </w:t>
+      </w:r>
+      <w:proofErr w:type="spellStart"/>
+      <w:r>
+        <w:t>operant_task_control.ino</w:t>
+      </w:r>
+      <w:proofErr w:type="spellEnd"/>
+      <w:r>
+        <w:t xml:space="preserve"> (/Arduino Files/</w:t>
+      </w:r>
+      <w:proofErr w:type="spellStart"/>
+      <w:r>
+        <w:t>operant_task_control</w:t>
+      </w:r>
+      <w:proofErr w:type="spellEnd"/>
+      <w:r>
+        <w:t>/)</w:t>
+      </w:r>
+      <w:r>
+        <w:t>.</w:t>
+      </w:r>
+    </w:p>
+    <w:tbl>
+      <w:tblPr>
+        <w:tblStyle w:val="TableGrid"/>
+        <w:tblW w:w="0" w:type="auto"/>
+        <w:tblLook w:val="04A0" w:firstRow="1" w:lastRow="0" w:firstColumn="1" w:lastColumn="0" w:noHBand="0" w:noVBand="1"/>
+      </w:tblPr>
+      <w:tblGrid>
+        <w:gridCol w:w="2155"/>
+        <w:gridCol w:w="1823"/>
+        <w:gridCol w:w="2227"/>
+        <w:gridCol w:w="1459"/>
+        <w:gridCol w:w="1686"/>
+      </w:tblGrid>
+      <w:tr>
+        <w:tc>
+          <w:tcPr>
+            <w:tcW w:w="2155" w:type="dxa"/>
+          </w:tcPr>
+          <w:p>
+            <w:pPr>
+              <w:jc w:val="center"/>
+              <w:rPr>
+                <w:b/>
+                <w:bCs/>
+              </w:rPr>
+            </w:pPr>
+            <w:r>
+              <w:rPr>
+                <w:b/>
+                <w:bCs/>
+              </w:rPr>
+              <w:t>Peripheral</w:t>
+            </w:r>
+          </w:p>
+        </w:tc>
+        <w:tc>
+          <w:tcPr>
+            <w:tcW w:w="1823" w:type="dxa"/>
+          </w:tcPr>
+          <w:p>
+            <w:pPr>
+              <w:jc w:val="center"/>
+              <w:rPr>
+                <w:b/>
+                <w:bCs/>
+              </w:rPr>
+            </w:pPr>
+            <w:r>
+              <w:rPr>
+                <w:b/>
+                <w:bCs/>
+              </w:rPr>
+              <w:t>Control Panel Channel</w:t>
+            </w:r>
+          </w:p>
+        </w:tc>
+        <w:tc>
+          <w:tcPr>
+            <w:tcW w:w="2227" w:type="dxa"/>
+          </w:tcPr>
+          <w:p>
+            <w:pPr>
+              <w:jc w:val="center"/>
+              <w:rPr>
+                <w:b/>
+                <w:bCs/>
+              </w:rPr>
+            </w:pPr>
+            <w:r>
+              <w:rPr>
+                <w:b/>
+                <w:bCs/>
+              </w:rPr>
+              <w:t>PCB Channel Number</w:t>
+            </w:r>
+          </w:p>
+        </w:tc>
+        <w:tc>
+          <w:tcPr>
+            <w:tcW w:w="1459" w:type="dxa"/>
+          </w:tcPr>
+          <w:p>
+            <w:pPr>
+              <w:jc w:val="center"/>
+              <w:rPr>
+                <w:b/>
+                <w:bCs/>
+              </w:rPr>
+            </w:pPr>
+            <w:r>
+              <w:rPr>
+                <w:b/>
+                <w:bCs/>
+              </w:rPr>
+              <w:t>Arduino Pin</w:t>
+            </w:r>
+          </w:p>
+        </w:tc>
+        <w:tc>
+          <w:tcPr>
+            <w:tcW w:w="1686" w:type="dxa"/>
+          </w:tcPr>
+          <w:p>
+            <w:pPr>
+              <w:jc w:val="center"/>
+              <w:rPr>
+                <w:b/>
+                <w:bCs/>
+              </w:rPr>
+            </w:pPr>
+            <w:r>
+              <w:rPr>
+                <w:b/>
+                <w:bCs/>
+              </w:rPr>
+              <w:t>Arduino Pin Variable Name</w:t>
+            </w:r>
+          </w:p>
+        </w:tc>
+      </w:tr>
+      <w:tr>
+        <w:tc>
+          <w:tcPr>
+            <w:tcW w:w="2155" w:type="dxa"/>
+          </w:tcPr>
+          <w:p>
+            <w:pPr>
+              <w:jc w:val="center"/>
+            </w:pPr>
+            <w:r>
+              <w:t>Water reward solenoid valve (Right)</w:t>
+            </w:r>
+          </w:p>
+        </w:tc>
+        <w:tc>
+          <w:tcPr>
+            <w:tcW w:w="1823" w:type="dxa"/>
+          </w:tcPr>
+          <w:p>
+            <w:pPr>
+              <w:jc w:val="center"/>
+            </w:pPr>
+            <w:r>
+              <w:t>1 (Output)</w:t>
+            </w:r>
+          </w:p>
+        </w:tc>
+        <w:tc>
+          <w:tcPr>
+            <w:tcW w:w="2227" w:type="dxa"/>
+          </w:tcPr>
+          <w:p>
+            <w:pPr>
+              <w:jc w:val="center"/>
+            </w:pPr>
+            <w:r>
+              <w:t>16 (Output)</w:t>
+            </w:r>
+          </w:p>
+        </w:tc>
+        <w:tc>
+          <w:tcPr>
+            <w:tcW w:w="1459" w:type="dxa"/>
+          </w:tcPr>
+          <w:p>
+            <w:pPr>
+              <w:jc w:val="center"/>
+            </w:pPr>
+            <w:r>
+              <w:t>2</w:t>
+            </w:r>
+          </w:p>
+        </w:tc>
+        <w:tc>
+          <w:tcPr>
+            <w:tcW w:w="1686" w:type="dxa"/>
+          </w:tcPr>
+          <w:p>
+            <w:pPr>
+              <w:jc w:val="center"/>
+            </w:pPr>
+            <w:proofErr w:type="spellStart"/>
+            <w:r>
+              <w:t>solR</w:t>
+            </w:r>
+            <w:proofErr w:type="spellEnd"/>
+          </w:p>
+        </w:tc>
+      </w:tr>
+      <w:tr>
+        <w:tc>
+          <w:tcPr>
+            <w:tcW w:w="2155" w:type="dxa"/>
+          </w:tcPr>
+          <w:p>
+            <w:pPr>
+              <w:jc w:val="center"/>
+            </w:pPr>
+            <w:r>
+              <w:t>Water reward solenoid valve (Left)</w:t>
+            </w:r>
+          </w:p>
+        </w:tc>
+        <w:tc>
+          <w:tcPr>
+            <w:tcW w:w="1823" w:type="dxa"/>
+          </w:tcPr>
+          <w:p>
+            <w:pPr>
+              <w:jc w:val="center"/>
+            </w:pPr>
+            <w:r>
+              <w:t>2 (Output)</w:t>
+            </w:r>
+          </w:p>
+        </w:tc>
+        <w:tc>
+          <w:tcPr>
+            <w:tcW w:w="2227" w:type="dxa"/>
+          </w:tcPr>
+          <w:p>
+            <w:pPr>
+              <w:jc w:val="center"/>
+            </w:pPr>
+            <w:r>
+              <w:t>15 (Output)</w:t>
+            </w:r>
+          </w:p>
+        </w:tc>
+        <w:tc>
+          <w:tcPr>
+            <w:tcW w:w="1459" w:type="dxa"/>
+          </w:tcPr>
+          <w:p>
+            <w:pPr>
+              <w:jc w:val="center"/>
+            </w:pPr>
+            <w:r>
+              <w:t>3</w:t>
+            </w:r>
+          </w:p>
+        </w:tc>
+        <w:tc>
+          <w:tcPr>
+            <w:tcW w:w="1686" w:type="dxa"/>
+          </w:tcPr>
+          <w:p>
+            <w:pPr>
+              <w:jc w:val="center"/>
+            </w:pPr>
+            <w:proofErr w:type="spellStart"/>
+            <w:r>
+              <w:t>solL</w:t>
+            </w:r>
+            <w:proofErr w:type="spellEnd"/>
+          </w:p>
+        </w:tc>
+      </w:tr>
+      <w:tr>
+        <w:tc>
+          <w:tcPr>
+            <w:tcW w:w="2155" w:type="dxa"/>
+          </w:tcPr>
+          <w:p>
+            <w:pPr>
+              <w:jc w:val="center"/>
+            </w:pPr>
+            <w:r>
+              <w:t>Door solenoid valve (Right)</w:t>
+            </w:r>
+          </w:p>
+        </w:tc>
+        <w:tc>
+          <w:tcPr>
+            <w:tcW w:w="1823" w:type="dxa"/>
+          </w:tcPr>
+          <w:p>
+            <w:pPr>
+              <w:jc w:val="center"/>
+            </w:pPr>
+            <w:r>
+              <w:t>3 (Output)</w:t>
+            </w:r>
+          </w:p>
+        </w:tc>
+        <w:tc>
+          <w:tcPr>
+            <w:tcW w:w="2227" w:type="dxa"/>
+          </w:tcPr>
+          <w:p>
+            <w:pPr>
+              <w:jc w:val="center"/>
+            </w:pPr>
+            <w:r>
+              <w:t>14 (Output)</w:t>
+            </w:r>
+          </w:p>
+        </w:tc>
+        <w:tc>
+          <w:tcPr>
+            <w:tcW w:w="1459" w:type="dxa"/>
+          </w:tcPr>
+          <w:p>
+            <w:pPr>
+              <w:jc w:val="center"/>
+            </w:pPr>
+            <w:r>
+              <w:t>4</w:t>
+            </w:r>
+          </w:p>
+        </w:tc>
+        <w:tc>
+          <w:tcPr>
+            <w:tcW w:w="1686" w:type="dxa"/>
+          </w:tcPr>
+          <w:p>
+            <w:pPr>
+              <w:jc w:val="center"/>
+            </w:pPr>
+            <w:proofErr w:type="spellStart"/>
+            <w:r>
+              <w:t>doorR</w:t>
+            </w:r>
+            <w:proofErr w:type="spellEnd"/>
+          </w:p>
+        </w:tc>
+      </w:tr>
+      <w:tr>
+        <w:tc>
+          <w:tcPr>
+            <w:tcW w:w="2155" w:type="dxa"/>
+          </w:tcPr>
+          <w:p>
+            <w:pPr>
+              <w:jc w:val="center"/>
+            </w:pPr>
+            <w:r>
+              <w:t>Door solenoid valve (Left)</w:t>
+            </w:r>
+          </w:p>
+        </w:tc>
+        <w:tc>
+          <w:tcPr>
+            <w:tcW w:w="1823" w:type="dxa"/>
+          </w:tcPr>
+          <w:p>
+            <w:pPr>
+              <w:jc w:val="center"/>
+            </w:pPr>
+            <w:r>
+              <w:t>4 (Output)</w:t>
+            </w:r>
+          </w:p>
+        </w:tc>
+        <w:tc>
+          <w:tcPr>
+            <w:tcW w:w="2227" w:type="dxa"/>
+          </w:tcPr>
+          <w:p>
+            <w:pPr>
+              <w:jc w:val="center"/>
+            </w:pPr>
+            <w:r>
+              <w:t>13 (Output)</w:t>
+            </w:r>
+          </w:p>
+        </w:tc>
+        <w:tc>
+          <w:tcPr>
+            <w:tcW w:w="1459" w:type="dxa"/>
+          </w:tcPr>
+          <w:p>
+            <w:pPr>
+              <w:jc w:val="center"/>
+            </w:pPr>
+            <w:r>
+              <w:t>5</w:t>
+            </w:r>
+          </w:p>
+        </w:tc>
+        <w:tc>
+          <w:tcPr>
+            <w:tcW w:w="1686" w:type="dxa"/>
+          </w:tcPr>
+          <w:p>
+            <w:pPr>
+              <w:jc w:val="center"/>
+            </w:pPr>
+            <w:proofErr w:type="spellStart"/>
+            <w:r>
+              <w:t>doorL</w:t>
+            </w:r>
+            <w:proofErr w:type="spellEnd"/>
+          </w:p>
+        </w:tc>
+      </w:tr>
+      <w:tr>
+        <w:tc>
+          <w:tcPr>
+            <w:tcW w:w="2155" w:type="dxa"/>
+          </w:tcPr>
+          <w:p>
+            <w:pPr>
+              <w:jc w:val="center"/>
+            </w:pPr>
+            <w:proofErr w:type="spellStart"/>
+            <w:r>
+              <w:t>Houselight</w:t>
+            </w:r>
+            <w:proofErr w:type="spellEnd"/>
+          </w:p>
+        </w:tc>
+        <w:tc>
+          <w:tcPr>
+            <w:tcW w:w="1823" w:type="dxa"/>
+          </w:tcPr>
+          <w:p>
+            <w:pPr>
+              <w:jc w:val="center"/>
+            </w:pPr>
+            <w:r>
+              <w:t>5 (Output)</w:t>
+            </w:r>
+          </w:p>
+        </w:tc>
+        <w:tc>
+          <w:tcPr>
+            <w:tcW w:w="2227" w:type="dxa"/>
+          </w:tcPr>
+          <w:p>
+            <w:pPr>
+              <w:jc w:val="center"/>
+            </w:pPr>
+            <w:r>
+              <w:t>12 (Output)</w:t>
+            </w:r>
+          </w:p>
+        </w:tc>
+        <w:tc>
+          <w:tcPr>
+            <w:tcW w:w="1459" w:type="dxa"/>
+          </w:tcPr>
+          <w:p>
+            <w:pPr>
+              <w:jc w:val="center"/>
+            </w:pPr>
+            <w:r>
+              <w:t>6</w:t>
+            </w:r>
+          </w:p>
+        </w:tc>
+        <w:tc>
+          <w:tcPr>
+            <w:tcW w:w="1686" w:type="dxa"/>
+          </w:tcPr>
+          <w:p>
+            <w:pPr>
+              <w:jc w:val="center"/>
+            </w:pPr>
+            <w:proofErr w:type="spellStart"/>
+            <w:r>
+              <w:t>lightPin</w:t>
+            </w:r>
+            <w:proofErr w:type="spellEnd"/>
+          </w:p>
+        </w:tc>
+      </w:tr>
+      <w:tr>
+        <w:tc>
+          <w:tcPr>
+            <w:tcW w:w="2155" w:type="dxa"/>
+          </w:tcPr>
+          <w:p>
+            <w:pPr>
+              <w:jc w:val="center"/>
+            </w:pPr>
+            <w:r>
+              <w:t>Sound indicator</w:t>
+            </w:r>
+          </w:p>
+        </w:tc>
+        <w:tc>
+          <w:tcPr>
+            <w:tcW w:w="1823" w:type="dxa"/>
+          </w:tcPr>
+          <w:p>
+            <w:pPr>
+              <w:jc w:val="center"/>
+            </w:pPr>
+            <w:r>
+              <w:t>6 (Output)</w:t>
+            </w:r>
+          </w:p>
+        </w:tc>
+        <w:tc>
+          <w:tcPr>
+            <w:tcW w:w="2227" w:type="dxa"/>
+          </w:tcPr>
+          <w:p>
+            <w:pPr>
+              <w:jc w:val="center"/>
+            </w:pPr>
+            <w:r>
+              <w:t>11 (Output)</w:t>
+            </w:r>
+          </w:p>
+        </w:tc>
+        <w:tc>
+          <w:tcPr>
+            <w:tcW w:w="1459" w:type="dxa"/>
+          </w:tcPr>
+          <w:p>
+            <w:pPr>
+              <w:jc w:val="center"/>
+            </w:pPr>
+            <w:r>
+              <w:t>7</w:t>
+            </w:r>
+          </w:p>
+        </w:tc>
+        <w:tc>
+          <w:tcPr>
+            <w:tcW w:w="1686" w:type="dxa"/>
+          </w:tcPr>
+          <w:p>
+            <w:pPr>
+              <w:jc w:val="center"/>
+            </w:pPr>
+            <w:proofErr w:type="spellStart"/>
+            <w:r>
+              <w:t>toneS</w:t>
+            </w:r>
+            <w:proofErr w:type="spellEnd"/>
+          </w:p>
+        </w:tc>
+      </w:tr>
+      <w:tr>
+        <w:tc>
+          <w:tcPr>
+            <w:tcW w:w="2155" w:type="dxa"/>
+          </w:tcPr>
+          <w:p>
+            <w:pPr>
+              <w:jc w:val="center"/>
+            </w:pPr>
+            <w:r>
+              <w:t>IR motion sensor (Right)</w:t>
+            </w:r>
+          </w:p>
+        </w:tc>
+        <w:tc>
+          <w:tcPr>
+            <w:tcW w:w="1823" w:type="dxa"/>
+          </w:tcPr>
+          <w:p>
+            <w:pPr>
+              <w:jc w:val="center"/>
+            </w:pPr>
+            <w:r>
+              <w:t>8 (Input)</w:t>
+            </w:r>
+          </w:p>
+        </w:tc>
+        <w:tc>
+          <w:tcPr>
+            <w:tcW w:w="2227" w:type="dxa"/>
+          </w:tcPr>
+          <w:p>
+            <w:pPr>
+              <w:jc w:val="center"/>
+            </w:pPr>
+            <w:r>
+              <w:t>8 (Input)</w:t>
+            </w:r>
+          </w:p>
+        </w:tc>
+        <w:tc>
+          <w:tcPr>
+            <w:tcW w:w="1459" w:type="dxa"/>
+          </w:tcPr>
+          <w:p>
+            <w:pPr>
+              <w:jc w:val="center"/>
+            </w:pPr>
+            <w:r>
+              <w:t>8</w:t>
+            </w:r>
+          </w:p>
+        </w:tc>
+        <w:tc>
+          <w:tcPr>
+            <w:tcW w:w="1686" w:type="dxa"/>
+          </w:tcPr>
+          <w:p>
+            <w:pPr>
+              <w:jc w:val="center"/>
+            </w:pPr>
+            <w:proofErr w:type="spellStart"/>
+            <w:r>
+              <w:t>senR</w:t>
+            </w:r>
+            <w:proofErr w:type="spellEnd"/>
+          </w:p>
+        </w:tc>
+      </w:tr>
+      <w:tr>
+        <w:tc>
+          <w:tcPr>
+            <w:tcW w:w="2155" w:type="dxa"/>
+          </w:tcPr>
+          <w:p>
+            <w:pPr>
+              <w:jc w:val="center"/>
+            </w:pPr>
+            <w:r>
+              <w:t>IR motion sensor (Left)</w:t>
+            </w:r>
+          </w:p>
+        </w:tc>
+        <w:tc>
+          <w:tcPr>
+            <w:tcW w:w="1823" w:type="dxa"/>
+          </w:tcPr>
+          <w:p>
+            <w:pPr>
+              <w:jc w:val="center"/>
+            </w:pPr>
+            <w:r>
+              <w:t>7 (Input)</w:t>
+            </w:r>
+          </w:p>
+        </w:tc>
+        <w:tc>
+          <w:tcPr>
+            <w:tcW w:w="2227" w:type="dxa"/>
+          </w:tcPr>
+          <w:p>
+            <w:pPr>
+              <w:jc w:val="center"/>
+            </w:pPr>
+            <w:r>
+              <w:t>7 (Input)</w:t>
+            </w:r>
+          </w:p>
+        </w:tc>
+        <w:tc>
+          <w:tcPr>
+            <w:tcW w:w="1459" w:type="dxa"/>
+          </w:tcPr>
+          <w:p>
+            <w:pPr>
+              <w:jc w:val="center"/>
+            </w:pPr>
+            <w:r>
+              <w:t>9</w:t>
+            </w:r>
+          </w:p>
+        </w:tc>
+        <w:tc>
+          <w:tcPr>
+            <w:tcW w:w="1686" w:type="dxa"/>
+          </w:tcPr>
+          <w:p>
+            <w:pPr>
+              <w:jc w:val="center"/>
+            </w:pPr>
+            <w:proofErr w:type="spellStart"/>
+            <w:r>
+              <w:t>senL</w:t>
+            </w:r>
+            <w:proofErr w:type="spellEnd"/>
+          </w:p>
+        </w:tc>
+      </w:tr>
+    </w:tbl>
+    <w:p>
+      <w:r>
+        <w:lastRenderedPageBreak/>
+        <w:t xml:space="preserve">The following three figures illustrate how to connect the IR motion sensor </w:t>
+      </w:r>
+      <w:proofErr w:type="gramStart"/>
+      <w:r>
+        <w:t>for</w:t>
+      </w:r>
+      <w:proofErr w:type="gramEnd"/>
+      <w:r>
+        <w:t xml:space="preserve"> the left port of the </w:t>
+      </w:r>
+      <w:proofErr w:type="gramStart"/>
+      <w:r>
+        <w:t>operant</w:t>
+      </w:r>
+      <w:proofErr w:type="gramEnd"/>
+      <w:r>
+        <w:t xml:space="preserve"> chamber.</w:t>
+      </w:r>
+    </w:p>
+    <w:p>
+      <w:pPr>
+        <w:pStyle w:val="ListParagraph"/>
+        <w:numPr>
+          <w:ilvl w:val="0"/>
+          <w:numId w:val="9"/>
+        </w:numPr>
+      </w:pPr>
+      <w:r>
+        <w:t>The cable from the IR motion sensor, fixed to the operant chamber, is routed to Input 7 of the Med Associates control panel.</w:t>
+      </w:r>
+    </w:p>
+    <w:p>
+      <w:pPr>
+        <w:jc w:val="center"/>
+      </w:pPr>
+      <w:r>
+        <w:rPr>
+          <w:noProof/>
+        </w:rPr>
+        <w:drawing>
+          <wp:inline distT="0" distB="0" distL="0" distR="0" wp14:anchorId="7A0469C7" wp14:editId="073DDB64">
+            <wp:extent cx="5994445" cy="2844800"/>
+            <wp:effectExtent l="0" t="0" r="6350" b="0"/>
+            <wp:docPr id="1912056233" name="Picture 1"/>
+            <wp:cNvGraphicFramePr>
+              <a:graphicFrameLocks xmlns:a="http://schemas.openxmlformats.org/drawingml/2006/main" noChangeAspect="1"/>
+            </wp:cNvGraphicFramePr>
+            <a:graphic xmlns:a="http://schemas.openxmlformats.org/drawingml/2006/main">
+              <a:graphicData uri="http://schemas.openxmlformats.org/drawingml/2006/picture">
+                <pic:pic xmlns:pic="http://schemas.openxmlformats.org/drawingml/2006/picture">
+                  <pic:nvPicPr>
+                    <pic:cNvPr id="0" name="Picture 1"/>
+                    <pic:cNvPicPr>
+                      <a:picLocks noChangeAspect="1" noChangeArrowheads="1"/>
+                    </pic:cNvPicPr>
+                  </pic:nvPicPr>
+                  <pic:blipFill>
+                    <a:blip r:embed="rId10" cstate="print">
+                      <a:extLst>
+                        <a:ext uri="{28A0092B-C50C-407E-A947-70E740481C1C}">
+                          <a14:useLocalDpi xmlns:a14="http://schemas.microsoft.com/office/drawing/2010/main" val="0"/>
+                        </a:ext>
+                      </a:extLst>
+                    </a:blip>
+                    <a:srcRect/>
+                    <a:stretch>
+                      <a:fillRect/>
+                    </a:stretch>
+                  </pic:blipFill>
+                  <pic:spPr bwMode="auto">
+                    <a:xfrm>
+                      <a:off x="0" y="0"/>
+                      <a:ext cx="6028370" cy="2860900"/>
+                    </a:xfrm>
+                    <a:prstGeom prst="rect">
+                      <a:avLst/>
+                    </a:prstGeom>
+                    <a:noFill/>
+                    <a:ln>
+                      <a:noFill/>
+                    </a:ln>
+                  </pic:spPr>
+                </pic:pic>
+              </a:graphicData>
+            </a:graphic>
+          </wp:inline>
+        </w:drawing>
+      </w:r>
+    </w:p>
+    <w:p>
+      <w:pPr>
+        <w:pStyle w:val="ListParagraph"/>
+        <w:numPr>
+          <w:ilvl w:val="0"/>
+          <w:numId w:val="9"/>
+        </w:numPr>
+      </w:pPr>
+      <w:r>
+        <w:t>A DB25 cable (</w:t>
+      </w:r>
+      <w:proofErr w:type="gramStart"/>
+      <w:r>
+        <w:t>circled in</w:t>
+      </w:r>
+      <w:proofErr w:type="gramEnd"/>
+      <w:r>
+        <w:t xml:space="preserve"> green) connects the Med Associates control panel to the custom PCB. Additionally, power is supplied through </w:t>
+      </w:r>
+      <w:proofErr w:type="gramStart"/>
+      <w:r>
+        <w:t>the custom</w:t>
+      </w:r>
+      <w:proofErr w:type="gramEnd"/>
+      <w:r>
+        <w:t xml:space="preserve"> PCB using a 28V wall outlet adapter. Two wires (orange and green in the middle image) that are soldered to </w:t>
+      </w:r>
+      <w:proofErr w:type="gramStart"/>
+      <w:r>
+        <w:t>the custom</w:t>
+      </w:r>
+      <w:proofErr w:type="gramEnd"/>
+      <w:r>
+        <w:t xml:space="preserve"> PCB are routed to the power input on the Med Associates control panel (circled in blue).</w:t>
+      </w:r>
+    </w:p>
+    <w:p>
+      <w:pPr>
+        <w:jc w:val="center"/>
+      </w:pPr>
+      <w:r>
+        <w:rPr>
+          <w:noProof/>
+        </w:rPr>
+        <w:drawing>
+          <wp:inline distT="0" distB="0" distL="0" distR="0" wp14:anchorId="1EAF1039" wp14:editId="5A2D79D8">
+            <wp:extent cx="6237534" cy="2317750"/>
+            <wp:effectExtent l="0" t="0" r="0" b="6350"/>
+            <wp:docPr id="962350763" name="Picture 2"/>
+            <wp:cNvGraphicFramePr>
+              <a:graphicFrameLocks xmlns:a="http://schemas.openxmlformats.org/drawingml/2006/main" noChangeAspect="1"/>
+            </wp:cNvGraphicFramePr>
+            <a:graphic xmlns:a="http://schemas.openxmlformats.org/drawingml/2006/main">
+              <a:graphicData uri="http://schemas.openxmlformats.org/drawingml/2006/picture">
+                <pic:pic xmlns:pic="http://schemas.openxmlformats.org/drawingml/2006/picture">
+                  <pic:nvPicPr>
+                    <pic:cNvPr id="0" name="Picture 2"/>
+                    <pic:cNvPicPr>
+                      <a:picLocks noChangeAspect="1" noChangeArrowheads="1"/>
+                    </pic:cNvPicPr>
+                  </pic:nvPicPr>
+                  <pic:blipFill>
+                    <a:blip r:embed="rId11" cstate="print">
+                      <a:extLst>
+                        <a:ext uri="{28A0092B-C50C-407E-A947-70E740481C1C}">
+                          <a14:useLocalDpi xmlns:a14="http://schemas.microsoft.com/office/drawing/2010/main" val="0"/>
+                        </a:ext>
+                      </a:extLst>
+                    </a:blip>
+                    <a:srcRect/>
+                    <a:stretch>
+                      <a:fillRect/>
+                    </a:stretch>
+                  </pic:blipFill>
+                  <pic:spPr bwMode="auto">
+                    <a:xfrm>
+                      <a:off x="0" y="0"/>
+                      <a:ext cx="6261677" cy="2326721"/>
+                    </a:xfrm>
+                    <a:prstGeom prst="rect">
+                      <a:avLst/>
+                    </a:prstGeom>
+                    <a:noFill/>
+                    <a:ln>
+                      <a:noFill/>
+                    </a:ln>
+                  </pic:spPr>
+                </pic:pic>
+              </a:graphicData>
+            </a:graphic>
+          </wp:inline>
+        </w:drawing>
+      </w:r>
+    </w:p>
+    <w:p>
+      <w:pPr>
+        <w:jc w:val="center"/>
+      </w:pPr>
+    </w:p>
+    <w:p>
+      <w:pPr>
+        <w:jc w:val="center"/>
+      </w:pPr>
+    </w:p>
+    <w:p>
+      <w:pPr>
+        <w:jc w:val="center"/>
+      </w:pPr>
+    </w:p>
+    <w:p>
+      <w:pPr>
+        <w:jc w:val="center"/>
+      </w:pPr>
+    </w:p>
+    <w:p>
+      <w:pPr>
+        <w:pStyle w:val="ListParagraph"/>
+        <w:numPr>
+          <w:ilvl w:val="0"/>
+          <w:numId w:val="9"/>
+        </w:numPr>
+      </w:pPr>
+      <w:r>
+        <w:lastRenderedPageBreak/>
+        <w:t xml:space="preserve">Finally, a jumper wire connects pin 9 of the Arduino to Input 7 on the custom PCB. Importantly, the ground pin (GND) of the Arduino must also be connected to the GND on </w:t>
+      </w:r>
+      <w:proofErr w:type="gramStart"/>
+      <w:r>
+        <w:t>the custom</w:t>
+      </w:r>
+      <w:proofErr w:type="gramEnd"/>
+      <w:r>
+        <w:t xml:space="preserve"> PCB.  </w:t>
+      </w:r>
+    </w:p>
+    <w:p>
+      <w:pPr>
+        <w:jc w:val="center"/>
+      </w:pPr>
+      <w:r>
+        <w:rPr>
+          <w:noProof/>
+        </w:rPr>
+        <w:drawing>
+          <wp:inline distT="0" distB="0" distL="0" distR="0" wp14:anchorId="7A4686E0" wp14:editId="34003B62">
+            <wp:extent cx="4419600" cy="2139339"/>
+            <wp:effectExtent l="0" t="0" r="0" b="0"/>
+            <wp:docPr id="172264884" name="Picture 3"/>
+            <wp:cNvGraphicFramePr>
+              <a:graphicFrameLocks xmlns:a="http://schemas.openxmlformats.org/drawingml/2006/main" noChangeAspect="1"/>
+            </wp:cNvGraphicFramePr>
+            <a:graphic xmlns:a="http://schemas.openxmlformats.org/drawingml/2006/main">
+              <a:graphicData uri="http://schemas.openxmlformats.org/drawingml/2006/picture">
+                <pic:pic xmlns:pic="http://schemas.openxmlformats.org/drawingml/2006/picture">
+                  <pic:nvPicPr>
+                    <pic:cNvPr id="0" name="Picture 3"/>
+                    <pic:cNvPicPr>
+                      <a:picLocks noChangeAspect="1" noChangeArrowheads="1"/>
+                    </pic:cNvPicPr>
+                  </pic:nvPicPr>
+                  <pic:blipFill>
+                    <a:blip r:embed="rId12" cstate="print">
+                      <a:extLst>
+                        <a:ext uri="{28A0092B-C50C-407E-A947-70E740481C1C}">
+                          <a14:useLocalDpi xmlns:a14="http://schemas.microsoft.com/office/drawing/2010/main" val="0"/>
+                        </a:ext>
+                      </a:extLst>
+                    </a:blip>
+                    <a:srcRect/>
+                    <a:stretch>
+                      <a:fillRect/>
+                    </a:stretch>
+                  </pic:blipFill>
+                  <pic:spPr bwMode="auto">
+                    <a:xfrm>
+                      <a:off x="0" y="0"/>
+                      <a:ext cx="4425246" cy="2142072"/>
+                    </a:xfrm>
+                    <a:prstGeom prst="rect">
+                      <a:avLst/>
+                    </a:prstGeom>
+                    <a:noFill/>
+                    <a:ln>
+                      <a:noFill/>
+                    </a:ln>
+                  </pic:spPr>
+                </pic:pic>
+              </a:graphicData>
+            </a:graphic>
+          </wp:inline>
+        </w:drawing>
+      </w:r>
+    </w:p>
     <w:p>
       <w:pPr>
         <w:pStyle w:val="Heading1"/>
@@ -1977,16 +3046,13 @@
     <w:p>
       <w:r>
         <w:tab/>
-        <w:t>The following sections are included to summarize the installation and troubleshooting of softwares used within the entire proposed system</w:t>
+        <w:t>The following sections are included to summarize the installation and troubleshooting of software used within the entire proposed system</w:t>
       </w:r>
       <w:r>
         <w:t>, from the client application to the representative state transfer (REST or RESTful) application programming interface (API)</w:t>
       </w:r>
       <w:r>
         <w:t xml:space="preserve">. </w:t>
-      </w:r>
-      <w:r>
-        <w:t>[could say more]</w:t>
       </w:r>
     </w:p>
     <w:p>
@@ -2027,7 +3093,7 @@
       <w:r>
         <w:t>serve. The latest version of Node.js can be downloaded from their official website (</w:t>
       </w:r>
-      <w:hyperlink r:id="rId10" w:history="1">
+      <w:hyperlink r:id="rId13" w:history="1">
         <w:r>
           <w:rPr>
             <w:rStyle w:val="Hyperlink"/>
@@ -2041,7 +3107,7 @@
       <w:r>
         <w:t>The latest version of Git can be downloaded from their official website (</w:t>
       </w:r>
-      <w:hyperlink r:id="rId11" w:history="1">
+      <w:hyperlink r:id="rId14" w:history="1">
         <w:r>
           <w:rPr>
             <w:rStyle w:val="Hyperlink"/>
@@ -2050,13 +3116,17 @@
         </w:r>
       </w:hyperlink>
       <w:r>
-        <w:t xml:space="preserve">), and </w:t>
-      </w:r>
-      <w:r>
-        <w:lastRenderedPageBreak/>
-        <w:t>the version used in this project can be found in Table Y2. Once those are installed, appropriate commands from the npm package manager can be executed within the command terminal to download the Angular CLI (</w:t>
-      </w:r>
-      <w:hyperlink r:id="rId12" w:history="1">
+        <w:t xml:space="preserve">), and the version used in this project can be found in Table Y2. Once those are installed, appropriate commands from the </w:t>
+      </w:r>
+      <w:proofErr w:type="spellStart"/>
+      <w:r>
+        <w:t>npm</w:t>
+      </w:r>
+      <w:proofErr w:type="spellEnd"/>
+      <w:r>
+        <w:t xml:space="preserve"> package manager can be executed within the command terminal to download the Angular CLI (</w:t>
+      </w:r>
+      <w:hyperlink r:id="rId15" w:history="1">
         <w:r>
           <w:rPr>
             <w:rStyle w:val="Hyperlink"/>
@@ -2072,8 +3142,21 @@
       <w:pPr>
         <w:jc w:val="center"/>
       </w:pPr>
-      <w:r>
-        <w:t>npm install -g @angular/cli</w:t>
+      <w:proofErr w:type="spellStart"/>
+      <w:r>
+        <w:t>npm</w:t>
+      </w:r>
+      <w:proofErr w:type="spellEnd"/>
+      <w:r>
+        <w:t xml:space="preserve"> install -</w:t>
+      </w:r>
+      <w:proofErr w:type="gramStart"/>
+      <w:r>
+        <w:t>g @</w:t>
+      </w:r>
+      <w:proofErr w:type="gramEnd"/>
+      <w:r>
+        <w:t>angular/cli</w:t>
       </w:r>
     </w:p>
     <w:p>
@@ -2087,7 +3170,15 @@
         <w:t xml:space="preserve"> Default settings were accepted in each software’s installation, and administration permissions were not required from my limited experience.</w:t>
       </w:r>
       <w:r>
-        <w:t xml:space="preserve"> These softwares must be installed to build and serve Angular applications.</w:t>
+        <w:t xml:space="preserve"> These </w:t>
+      </w:r>
+      <w:proofErr w:type="spellStart"/>
+      <w:r>
+        <w:t>softwares</w:t>
+      </w:r>
+      <w:proofErr w:type="spellEnd"/>
+      <w:r>
+        <w:t xml:space="preserve"> must be installed to build and serve Angular applications.</w:t>
       </w:r>
     </w:p>
     <w:p/>
@@ -2097,6 +3188,7 @@
       </w:pPr>
       <w:bookmarkStart w:id="7" w:name="_Toc140500025"/>
       <w:r>
+        <w:lastRenderedPageBreak/>
         <w:t>Creating a New Application</w:t>
       </w:r>
       <w:bookmarkEnd w:id="7"/>
@@ -2109,7 +3201,7 @@
       <w:r>
         <w:t>the code can be easily replaced and customized – even the HTML file acknowledges this in included comments. These steps were adapted from the official Angular website (</w:t>
       </w:r>
-      <w:hyperlink r:id="rId13" w:history="1">
+      <w:hyperlink r:id="rId16" w:history="1">
         <w:r>
           <w:rPr>
             <w:rStyle w:val="Hyperlink"/>
@@ -2191,7 +3283,7 @@
       <w:r>
         <w:t xml:space="preserve">e: </w:t>
       </w:r>
-      <w:hyperlink r:id="rId14" w:history="1">
+      <w:hyperlink r:id="rId17" w:history="1">
         <w:r>
           <w:rPr>
             <w:rStyle w:val="Hyperlink"/>
@@ -2275,12 +3367,28 @@
         <w:t xml:space="preserve"> </w:t>
       </w:r>
       <w:r>
-        <w:t>The first method creates a folder called “node_modules” in whatever directory it was downloaded in from the command terminal, which acts as either a public or private npm registry for Angular applications to use</w:t>
+        <w:t>The first method creates a folder called “</w:t>
+      </w:r>
+      <w:proofErr w:type="spellStart"/>
+      <w:r>
+        <w:t>node_modules</w:t>
+      </w:r>
+      <w:proofErr w:type="spellEnd"/>
+      <w:r>
+        <w:t xml:space="preserve">” in whatever directory it was downloaded in from the command terminal, which acts as either a public or private </w:t>
+      </w:r>
+      <w:proofErr w:type="spellStart"/>
+      <w:r>
+        <w:t>npm</w:t>
+      </w:r>
+      <w:proofErr w:type="spellEnd"/>
+      <w:r>
+        <w:t xml:space="preserve"> registry for Angular applications to use</w:t>
       </w:r>
       <w:r>
         <w:t xml:space="preserve"> (</w:t>
       </w:r>
-      <w:hyperlink r:id="rId15" w:history="1">
+      <w:hyperlink r:id="rId18" w:history="1">
         <w:r>
           <w:rPr>
             <w:rStyle w:val="Hyperlink"/>
@@ -2292,16 +3400,20 @@
         <w:t>)</w:t>
       </w:r>
       <w:r>
-        <w:t>. In later versions of the npm package manager, such as used in this project, the “-- save" is no longer necessary</w:t>
-      </w:r>
-      <w:r>
-        <w:t xml:space="preserve"> </w:t>
-      </w:r>
-      <w:r>
-        <w:lastRenderedPageBreak/>
-        <w:t>(</w:t>
-      </w:r>
-      <w:hyperlink r:id="rId16" w:history="1">
+        <w:t xml:space="preserve">. In later versions of the </w:t>
+      </w:r>
+      <w:proofErr w:type="spellStart"/>
+      <w:r>
+        <w:t>npm</w:t>
+      </w:r>
+      <w:proofErr w:type="spellEnd"/>
+      <w:r>
+        <w:t xml:space="preserve"> package manager, such as used in this project, the “-- save" is no longer necessary</w:t>
+      </w:r>
+      <w:r>
+        <w:t xml:space="preserve"> (</w:t>
+      </w:r>
+      <w:hyperlink r:id="rId19" w:history="1">
         <w:r>
           <w:rPr>
             <w:rStyle w:val="Hyperlink"/>
@@ -2313,7 +3425,15 @@
         <w:t>)</w:t>
       </w:r>
       <w:r>
-        <w:t>, but I wanted to include the exact commands I used in my original downloads. The second method directly adds the Angular Material packages into the “node_modules” folder that is present within the Angular project directory, which just saves an extra registry being present elsewhere on the local hard drive.</w:t>
+        <w:t>, but I wanted to include the exact commands I used in my original downloads. The second method directly adds the Angular Material packages into the “</w:t>
+      </w:r>
+      <w:proofErr w:type="spellStart"/>
+      <w:r>
+        <w:t>node_modules</w:t>
+      </w:r>
+      <w:proofErr w:type="spellEnd"/>
+      <w:r>
+        <w:t>” folder that is present within the Angular project directory, which just saves an extra registry being present elsewhere on the local hard drive.</w:t>
       </w:r>
     </w:p>
     <w:p>
@@ -2362,8 +3482,21 @@
         <w:pStyle w:val="ListParagraph"/>
         <w:jc w:val="center"/>
       </w:pPr>
-      <w:r>
-        <w:t>npm install --save @angular/material</w:t>
+      <w:proofErr w:type="spellStart"/>
+      <w:r>
+        <w:t>npm</w:t>
+      </w:r>
+      <w:proofErr w:type="spellEnd"/>
+      <w:r>
+        <w:t xml:space="preserve"> install --</w:t>
+      </w:r>
+      <w:proofErr w:type="gramStart"/>
+      <w:r>
+        <w:t>save @</w:t>
+      </w:r>
+      <w:proofErr w:type="gramEnd"/>
+      <w:r>
+        <w:t>angular/material</w:t>
       </w:r>
     </w:p>
     <w:p>
@@ -2375,6 +3508,7 @@
         </w:numPr>
       </w:pPr>
       <w:r>
+        <w:lastRenderedPageBreak/>
         <w:t>Packages should be added and audited, as indicated by text generated within the command terminal. The following is a sample of what was generated when doing this command:</w:t>
       </w:r>
     </w:p>
@@ -2408,7 +3542,15 @@
         <w:jc w:val="center"/>
       </w:pPr>
       <w:r>
-        <w:t xml:space="preserve">  run `npm fund` for details</w:t>
+        <w:t xml:space="preserve">  run `</w:t>
+      </w:r>
+      <w:proofErr w:type="spellStart"/>
+      <w:r>
+        <w:t>npm</w:t>
+      </w:r>
+      <w:proofErr w:type="spellEnd"/>
+      <w:r>
+        <w:t xml:space="preserve"> fund` for details</w:t>
       </w:r>
     </w:p>
     <w:p>
@@ -2472,7 +3614,15 @@
         <w:jc w:val="center"/>
       </w:pPr>
       <w:r>
-        <w:t>ng add @angular/material</w:t>
+        <w:t xml:space="preserve">ng </w:t>
+      </w:r>
+      <w:proofErr w:type="gramStart"/>
+      <w:r>
+        <w:t>add</w:t>
+      </w:r>
+      <w:proofErr w:type="gramEnd"/>
+      <w:r>
+        <w:t xml:space="preserve"> @angular/material</w:t>
       </w:r>
     </w:p>
     <w:p>
@@ -2571,7 +3721,7 @@
       <w:r>
         <w:t xml:space="preserve"> with the following steps. These steps outline the addition of the CSS style to the Angular application, but not the script aspect. Please reference </w:t>
       </w:r>
-      <w:hyperlink r:id="rId17" w:history="1">
+      <w:hyperlink r:id="rId20" w:history="1">
         <w:r>
           <w:rPr>
             <w:rStyle w:val="Hyperlink"/>
@@ -2626,9 +3776,13 @@
       <w:pPr>
         <w:jc w:val="center"/>
       </w:pPr>
-      <w:r>
-        <w:lastRenderedPageBreak/>
-        <w:t>npm install --save bootstrap</w:t>
+      <w:proofErr w:type="spellStart"/>
+      <w:r>
+        <w:t>npm</w:t>
+      </w:r>
+      <w:proofErr w:type="spellEnd"/>
+      <w:r>
+        <w:t xml:space="preserve"> install --save bootstrap</w:t>
       </w:r>
     </w:p>
     <w:p>
@@ -2640,7 +3794,15 @@
         </w:numPr>
       </w:pPr>
       <w:r>
-        <w:t>Packages will be installed into the “node_modules” directory within a folder with the same name.</w:t>
+        <w:t>Packages will be installed into the “</w:t>
+      </w:r>
+      <w:proofErr w:type="spellStart"/>
+      <w:r>
+        <w:t>node_modules</w:t>
+      </w:r>
+      <w:proofErr w:type="spellEnd"/>
+      <w:r>
+        <w:t>” directory within a folder with the same name.</w:t>
       </w:r>
     </w:p>
     <w:p>
@@ -2658,7 +3820,15 @@
         <w:t xml:space="preserve"> Microsoft</w:t>
       </w:r>
       <w:r>
-        <w:t xml:space="preserve"> Visual Studio, and open the angular.json file within your Angular project directory.</w:t>
+        <w:t xml:space="preserve"> Visual Studio, and open the </w:t>
+      </w:r>
+      <w:proofErr w:type="spellStart"/>
+      <w:r>
+        <w:t>angular.json</w:t>
+      </w:r>
+      <w:proofErr w:type="spellEnd"/>
+      <w:r>
+        <w:t xml:space="preserve"> file within your Angular project directory.</w:t>
       </w:r>
     </w:p>
     <w:p>
@@ -2673,10 +3843,28 @@
         <w:t>Find the styles property within the JSON file</w:t>
       </w:r>
       <w:r>
-        <w:t xml:space="preserve"> (“angular.JSON”)</w:t>
-      </w:r>
-      <w:r>
-        <w:t xml:space="preserve">, and add the file pathway to the </w:t>
+        <w:t xml:space="preserve"> (“</w:t>
+      </w:r>
+      <w:proofErr w:type="spellStart"/>
+      <w:proofErr w:type="gramStart"/>
+      <w:r>
+        <w:t>angular.JSON</w:t>
+      </w:r>
+      <w:proofErr w:type="spellEnd"/>
+      <w:proofErr w:type="gramEnd"/>
+      <w:r>
+        <w:t>”</w:t>
+      </w:r>
+      <w:proofErr w:type="gramStart"/>
+      <w:r>
+        <w:t>)</w:t>
+      </w:r>
+      <w:r>
+        <w:t>, and</w:t>
+      </w:r>
+      <w:proofErr w:type="gramEnd"/>
+      <w:r>
+        <w:t xml:space="preserve"> add the file pathway to the </w:t>
       </w:r>
       <w:r>
         <w:t>“bootstrap.min.css” file within array. A sample of this file pathway, which may not be yours, is as follows:</w:t>
@@ -2687,7 +3875,32 @@
         <w:jc w:val="center"/>
       </w:pPr>
       <w:r>
-        <w:t>"node_modules/bootstrap/dist/css/bootstrap.min.css"</w:t>
+        <w:lastRenderedPageBreak/>
+        <w:t>"</w:t>
+      </w:r>
+      <w:proofErr w:type="spellStart"/>
+      <w:r>
+        <w:t>node_modules</w:t>
+      </w:r>
+      <w:proofErr w:type="spellEnd"/>
+      <w:r>
+        <w:t>/bootstrap/</w:t>
+      </w:r>
+      <w:proofErr w:type="spellStart"/>
+      <w:r>
+        <w:t>dist</w:t>
+      </w:r>
+      <w:proofErr w:type="spellEnd"/>
+      <w:r>
+        <w:t>/</w:t>
+      </w:r>
+      <w:proofErr w:type="spellStart"/>
+      <w:r>
+        <w:t>css</w:t>
+      </w:r>
+      <w:proofErr w:type="spellEnd"/>
+      <w:r>
+        <w:t>/bootstrap.min.css"</w:t>
       </w:r>
     </w:p>
     <w:p>
@@ -2711,7 +3924,7 @@
       <w:r>
         <w:t xml:space="preserve"> that can streamline the coding process. These commands can be executed in a Developer PowerShell, like the one present in Microsoft Visual Studio, or in the command terminal within the Angular application’s directory. A summary of the commands are found at </w:t>
       </w:r>
-      <w:hyperlink r:id="rId18" w:history="1">
+      <w:hyperlink r:id="rId21" w:history="1">
         <w:r>
           <w:rPr>
             <w:rStyle w:val="Hyperlink"/>
@@ -2728,7 +3941,7 @@
       <w:r>
         <w:t xml:space="preserve"> </w:t>
       </w:r>
-      <w:hyperlink r:id="rId19" w:history="1">
+      <w:hyperlink r:id="rId22" w:history="1">
         <w:r>
           <w:rPr>
             <w:rStyle w:val="Hyperlink"/>
@@ -2739,7 +3952,7 @@
       <w:r>
         <w:t xml:space="preserve"> and </w:t>
       </w:r>
-      <w:hyperlink r:id="rId20" w:history="1">
+      <w:hyperlink r:id="rId23" w:history="1">
         <w:r>
           <w:rPr>
             <w:rStyle w:val="Hyperlink"/>
@@ -2791,7 +4004,7 @@
         <w:tab/>
         <w:t>The RESTful API was built out of modules made within the Python programming language. The most recent version of Python can be downloaded from their official website (</w:t>
       </w:r>
-      <w:hyperlink r:id="rId21" w:history="1">
+      <w:hyperlink r:id="rId24" w:history="1">
         <w:r>
           <w:rPr>
             <w:rStyle w:val="Hyperlink"/>
@@ -2828,7 +4041,7 @@
       <w:r>
         <w:t xml:space="preserve"> (</w:t>
       </w:r>
-      <w:hyperlink r:id="rId22" w:history="1">
+      <w:hyperlink r:id="rId25" w:history="1">
         <w:r>
           <w:rPr>
             <w:rStyle w:val="Hyperlink"/>
@@ -2858,13 +4071,17 @@
         <w:tab/>
       </w:r>
       <w:r>
-        <w:t xml:space="preserve">This project uses, and comes with an already established, virtual environment to isolate the Python packages and programs relevant to the RESTful API from the version requirements present </w:t>
-      </w:r>
-      <w:r>
-        <w:lastRenderedPageBreak/>
-        <w:t>elsewhere on the computer. This is an advantage to the use of virtual environments and the reason why the RESTful API was designed within one. To use the established virtual environment, skip the following steps until the instructions on activating the virtual environment. To create a new virtual environment, follow the steps that were adapted from (</w:t>
-      </w:r>
-      <w:hyperlink r:id="rId23" w:history="1">
+        <w:t xml:space="preserve">This project uses, and comes with an already established, virtual environment to isolate the Python packages and programs relevant to the RESTful API from the version requirements present elsewhere on the computer. This is an advantage to the use of virtual environments and the reason why </w:t>
+      </w:r>
+      <w:proofErr w:type="gramStart"/>
+      <w:r>
+        <w:t>the RESTful</w:t>
+      </w:r>
+      <w:proofErr w:type="gramEnd"/>
+      <w:r>
+        <w:t xml:space="preserve"> API was designed within one. To use the established virtual environment, skip the following steps until the instructions on activating the virtual environment. To create a new virtual environment, follow the steps that were adapted from (</w:t>
+      </w:r>
+      <w:hyperlink r:id="rId26" w:history="1">
         <w:r>
           <w:rPr>
             <w:rStyle w:val="Hyperlink"/>
@@ -2878,7 +4095,7 @@
       <w:r>
         <w:t xml:space="preserve"> and (</w:t>
       </w:r>
-      <w:hyperlink r:id="rId24" w:history="1">
+      <w:hyperlink r:id="rId27" w:history="1">
         <w:r>
           <w:rPr>
             <w:rStyle w:val="Hyperlink"/>
@@ -2914,7 +4131,15 @@
         </w:numPr>
       </w:pPr>
       <w:r>
-        <w:t>Navigate to a directory where the virtual environment dependencies, files, and more are desired to be stored in.</w:t>
+        <w:t xml:space="preserve">Navigate to a directory where the virtual environment </w:t>
+      </w:r>
+      <w:proofErr w:type="gramStart"/>
+      <w:r>
+        <w:t>dependencies,</w:t>
+      </w:r>
+      <w:proofErr w:type="gramEnd"/>
+      <w:r>
+        <w:t xml:space="preserve"> files, and more are desired to be stored in.</w:t>
       </w:r>
     </w:p>
     <w:p>
@@ -2934,8 +4159,24 @@
         <w:jc w:val="center"/>
       </w:pPr>
       <w:r>
-        <w:t>python -m venv .venv</w:t>
-      </w:r>
+        <w:lastRenderedPageBreak/>
+        <w:t xml:space="preserve">python -m </w:t>
+      </w:r>
+      <w:proofErr w:type="spellStart"/>
+      <w:proofErr w:type="gramStart"/>
+      <w:r>
+        <w:t>venv</w:t>
+      </w:r>
+      <w:proofErr w:type="spellEnd"/>
+      <w:r>
+        <w:t xml:space="preserve"> .</w:t>
+      </w:r>
+      <w:proofErr w:type="spellStart"/>
+      <w:r>
+        <w:t>venv</w:t>
+      </w:r>
+      <w:proofErr w:type="spellEnd"/>
+      <w:proofErr w:type="gramEnd"/>
     </w:p>
     <w:p>
       <w:pPr>
@@ -2946,7 +4187,20 @@
         </w:numPr>
       </w:pPr>
       <w:r>
-        <w:t>A directory will be created in the directory the command terminal was navigated to, and it will have the name “.venv”.</w:t>
+        <w:t xml:space="preserve">A directory will be created in the directory the command terminal was navigated to, and it will have the name </w:t>
+      </w:r>
+      <w:proofErr w:type="gramStart"/>
+      <w:r>
+        <w:t>“.</w:t>
+      </w:r>
+      <w:proofErr w:type="spellStart"/>
+      <w:r>
+        <w:t>venv</w:t>
+      </w:r>
+      <w:proofErr w:type="spellEnd"/>
+      <w:proofErr w:type="gramEnd"/>
+      <w:r>
+        <w:t>”.</w:t>
       </w:r>
     </w:p>
     <w:p>
@@ -2954,7 +4208,20 @@
         <w:ind w:firstLine="720"/>
       </w:pPr>
       <w:r>
-        <w:t>Once the virtual environment has been created it must be activated before modules can be installed within it or software within to be executed. Virtual environments are temporarily activated through the command terminal, navigated to the directory containing the “.venv” directory, with the following command:</w:t>
+        <w:t xml:space="preserve">Once the virtual environment has been created it must be activated before modules can be installed within it or software within to be executed. Virtual environments are temporarily activated through the command terminal, navigated to the directory containing the </w:t>
+      </w:r>
+      <w:proofErr w:type="gramStart"/>
+      <w:r>
+        <w:t>“.</w:t>
+      </w:r>
+      <w:proofErr w:type="spellStart"/>
+      <w:r>
+        <w:t>venv</w:t>
+      </w:r>
+      <w:proofErr w:type="spellEnd"/>
+      <w:proofErr w:type="gramEnd"/>
+      <w:r>
+        <w:t>” directory, with the following command:</w:t>
       </w:r>
     </w:p>
     <w:p>
@@ -2962,7 +4229,15 @@
         <w:jc w:val="center"/>
       </w:pPr>
       <w:r>
-        <w:t>.venv\Scripts\activate.bat</w:t>
+        <w:t>.</w:t>
+      </w:r>
+      <w:proofErr w:type="spellStart"/>
+      <w:r>
+        <w:t>venv</w:t>
+      </w:r>
+      <w:proofErr w:type="spellEnd"/>
+      <w:r>
+        <w:t>\Scripts\activate.bat</w:t>
       </w:r>
     </w:p>
     <w:p>
@@ -2973,7 +4248,15 @@
         <w:t>When activated, any Python programs inside can be executed, and any modules installed through pip will be installed within the folders of the virtual environment. One indicator that t</w:t>
       </w:r>
       <w:r>
-        <w:t>he virtual environment was opened in the command terminal is if the name of the virtual environment appears in parentheses before the file pathway (i.e. (.venv) C:\Users\...).</w:t>
+        <w:t>he virtual environment was opened in the command terminal is if the name of the virtual environment appears in parentheses before the file pathway (i.e. (.</w:t>
+      </w:r>
+      <w:proofErr w:type="spellStart"/>
+      <w:r>
+        <w:t>venv</w:t>
+      </w:r>
+      <w:proofErr w:type="spellEnd"/>
+      <w:r>
+        <w:t>) C:\Users\...).</w:t>
       </w:r>
       <w:r>
         <w:t xml:space="preserve"> A useful command to create a text file that displays all the installed modules is as follows:</w:t>
@@ -3050,7 +4333,7 @@
         <w:tab/>
         <w:t>Each following Python module will replace the &lt;module&gt; placeholder with a relevant identifier for pip to install the correct module. When installing Flask (</w:t>
       </w:r>
-      <w:hyperlink r:id="rId25" w:history="1">
+      <w:hyperlink r:id="rId28" w:history="1">
         <w:r>
           <w:rPr>
             <w:rStyle w:val="Hyperlink"/>
@@ -3067,28 +4350,34 @@
       <w:r>
         <w:t>lask instead of the placeholder. When installing Flask CORS (</w:t>
       </w:r>
-      <w:hyperlink r:id="rId26" w:history="1">
+      <w:hyperlink r:id="rId29" w:history="1">
         <w:r>
           <w:rPr>
             <w:rStyle w:val="Hyperlink"/>
           </w:rPr>
-          <w:t>https://flask-</w:t>
-        </w:r>
-        <w:r>
-          <w:rPr>
-            <w:rStyle w:val="Hyperlink"/>
-          </w:rPr>
-          <w:lastRenderedPageBreak/>
-          <w:t>cors.readthedocs.io/en/latest/</w:t>
+          <w:t>https://flask-cors.readthedocs.io/en/latest/</w:t>
         </w:r>
       </w:hyperlink>
       <w:r>
-        <w:t xml:space="preserve">) then include flask-cors instead of the placeholder. When installing </w:t>
-      </w:r>
-      <w:r>
-        <w:t>PySerial (</w:t>
-      </w:r>
-      <w:hyperlink r:id="rId27" w:anchor="installation" w:history="1">
+        <w:t>) then include flask-</w:t>
+      </w:r>
+      <w:proofErr w:type="spellStart"/>
+      <w:r>
+        <w:t>cors</w:t>
+      </w:r>
+      <w:proofErr w:type="spellEnd"/>
+      <w:r>
+        <w:t xml:space="preserve"> instead of the placeholder. When installing </w:t>
+      </w:r>
+      <w:proofErr w:type="spellStart"/>
+      <w:r>
+        <w:t>PySerial</w:t>
+      </w:r>
+      <w:proofErr w:type="spellEnd"/>
+      <w:r>
+        <w:t xml:space="preserve"> (</w:t>
+      </w:r>
+      <w:hyperlink r:id="rId30" w:anchor="installation" w:history="1">
         <w:r>
           <w:rPr>
             <w:rStyle w:val="Hyperlink"/>
@@ -3097,7 +4386,15 @@
         </w:r>
       </w:hyperlink>
       <w:r>
-        <w:t>) include pyserial instead of the placeholder. If necessary, freezing the software versions</w:t>
+        <w:t xml:space="preserve">) include </w:t>
+      </w:r>
+      <w:proofErr w:type="spellStart"/>
+      <w:r>
+        <w:t>pyserial</w:t>
+      </w:r>
+      <w:proofErr w:type="spellEnd"/>
+      <w:r>
+        <w:t xml:space="preserve"> instead of the placeholder. If necessary, freezing the software versions</w:t>
       </w:r>
       <w:r>
         <w:t xml:space="preserve"> of the modules within the virtual environment</w:t>
@@ -3123,9 +4420,21 @@
     <w:p>
       <w:r>
         <w:tab/>
-        <w:t>The Arduino IDE is necessary to not only modify or generate code for the Arduino microcontrollers, but it is also necessary to flash finished code into the on-board memory of the Arduino microcontroller. The IDE can be installed from the official website (</w:t>
-      </w:r>
-      <w:hyperlink r:id="rId28" w:history="1">
+        <w:t xml:space="preserve">The Arduino IDE is necessary to not only </w:t>
+      </w:r>
+      <w:proofErr w:type="gramStart"/>
+      <w:r>
+        <w:t>modify</w:t>
+      </w:r>
+      <w:proofErr w:type="gramEnd"/>
+      <w:r>
+        <w:t xml:space="preserve"> or generate code for the Arduino microcontrollers, but it is also necessary to flash finished code into the on-board memory of the Arduino </w:t>
+      </w:r>
+      <w:r>
+        <w:lastRenderedPageBreak/>
+        <w:t>microcontroller. The IDE can be installed from the official website (</w:t>
+      </w:r>
+      <w:hyperlink r:id="rId31" w:history="1">
         <w:r>
           <w:rPr>
             <w:rStyle w:val="Hyperlink"/>
@@ -3190,7 +4499,6 @@
     <w:p>
       <w:r>
         <w:tab/>
-        <w:t>[something summarizing this whole section, nothing long]</w:t>
       </w:r>
     </w:p>
     <w:p>
@@ -3209,12 +4517,12 @@
       <w:pPr>
         <w:pStyle w:val="ListParagraph"/>
         <w:numPr>
-          <w:ilvl w:val="0"/>
+          <w:ilvl w:val="1"/>
           <w:numId w:val="6"/>
         </w:numPr>
       </w:pPr>
       <w:r>
-        <w:t>Make sure URLs line up.</w:t>
+        <w:t>List of software versions located in /docs/Software Versions.xlsx</w:t>
       </w:r>
     </w:p>
     <w:p>
@@ -3226,7 +4534,7 @@
         </w:numPr>
       </w:pPr>
       <w:r>
-        <w:t>Review relevant sections of the installation section to see if there are notes.</w:t>
+        <w:t>Make sure URLs line up.</w:t>
       </w:r>
     </w:p>
     <w:p>
@@ -3238,6 +4546,18 @@
         </w:numPr>
       </w:pPr>
       <w:r>
+        <w:t>Review relevant sections of the installation section to see if there are notes.</w:t>
+      </w:r>
+    </w:p>
+    <w:p>
+      <w:pPr>
+        <w:pStyle w:val="ListParagraph"/>
+        <w:numPr>
+          <w:ilvl w:val="0"/>
+          <w:numId w:val="6"/>
+        </w:numPr>
+      </w:pPr>
+      <w:r>
         <w:t>Virtual environment variables:</w:t>
       </w:r>
     </w:p>
@@ -3249,8 +4569,13 @@
           <w:numId w:val="6"/>
         </w:numPr>
       </w:pPr>
-      <w:r>
-        <w:t>setx FLASK_APP "application.py"</w:t>
+      <w:proofErr w:type="spellStart"/>
+      <w:r>
+        <w:t>setx</w:t>
+      </w:r>
+      <w:proofErr w:type="spellEnd"/>
+      <w:r>
+        <w:t xml:space="preserve"> FLASK_APP "application.py"</w:t>
       </w:r>
     </w:p>
     <w:p>
@@ -3261,8 +4586,13 @@
           <w:numId w:val="6"/>
         </w:numPr>
       </w:pPr>
-      <w:r>
-        <w:t xml:space="preserve">setx </w:t>
+      <w:proofErr w:type="spellStart"/>
+      <w:r>
+        <w:t>setx</w:t>
+      </w:r>
+      <w:proofErr w:type="spellEnd"/>
+      <w:r>
+        <w:t xml:space="preserve"> </w:t>
       </w:r>
       <w:r>
         <w:t>FLASK_ENV "development"</w:t>
@@ -3278,14 +4608,6 @@
       </w:pPr>
       <w:r>
         <w:t>https://phoenixnap.com/kb/windows-set-environment-variable</w:t>
-      </w:r>
-    </w:p>
-    <w:p>
-      <w:pPr>
-        <w:jc w:val="center"/>
-      </w:pPr>
-      <w:r>
-        <w:t>[Table Y2 – software versions]</w:t>
       </w:r>
     </w:p>
     <w:p/>
@@ -3300,7 +4622,7 @@
 </file>
 
 <file path=word/numbering.xml><?xml version="1.0" encoding="utf-8"?>
-<w:numbering xmlns:wpc="http://schemas.microsoft.com/office/word/2010/wordprocessingCanvas" xmlns:cx="http://schemas.microsoft.com/office/drawing/2014/chartex" xmlns:cx1="http://schemas.microsoft.com/office/drawing/2015/9/8/chartex" xmlns:cx2="http://schemas.microsoft.com/office/drawing/2015/10/21/chartex" xmlns:cx3="http://schemas.microsoft.com/office/drawing/2016/5/9/chartex" xmlns:cx4="http://schemas.microsoft.com/office/drawing/2016/5/10/chartex" xmlns:cx5="http://schemas.microsoft.com/office/drawing/2016/5/11/chartex" xmlns:cx6="http://schemas.microsoft.com/office/drawing/2016/5/12/chartex" xmlns:cx7="http://schemas.microsoft.com/office/drawing/2016/5/13/chartex" xmlns:cx8="http://schemas.microsoft.com/office/drawing/2016/5/14/chartex" xmlns:mc="http://schemas.openxmlformats.org/markup-compatibility/2006" xmlns:aink="http://schemas.microsoft.com/office/drawing/2016/ink" xmlns:am3d="http://schemas.microsoft.com/office/drawing/2017/model3d" xmlns:o="urn:schemas-microsoft-com:office:office" xmlns:oel="http://schemas.microsoft.com/office/2019/extlst" xmlns:r="http://schemas.openxmlformats.org/officeDocument/2006/relationships" xmlns:m="http://schemas.openxmlformats.org/officeDocument/2006/math" xmlns:v="urn:schemas-microsoft-com:vml" xmlns:wp14="http://schemas.microsoft.com/office/word/2010/wordprocessingDrawing" xmlns:wp="http://schemas.openxmlformats.org/drawingml/2006/wordprocessingDrawing" xmlns:w10="urn:schemas-microsoft-com:office:word" xmlns:w="http://schemas.openxmlformats.org/wordprocessingml/2006/main" xmlns:w14="http://schemas.microsoft.com/office/word/2010/wordml" xmlns:w15="http://schemas.microsoft.com/office/word/2012/wordml" xmlns:w16cex="http://schemas.microsoft.com/office/word/2018/wordml/cex" xmlns:w16cid="http://schemas.microsoft.com/office/word/2016/wordml/cid" xmlns:w16="http://schemas.microsoft.com/office/word/2018/wordml" xmlns:w16sdtdh="http://schemas.microsoft.com/office/word/2020/wordml/sdtdatahash" xmlns:w16se="http://schemas.microsoft.com/office/word/2015/wordml/symex" xmlns:wpg="http://schemas.microsoft.com/office/word/2010/wordprocessingGroup" xmlns:wpi="http://schemas.microsoft.com/office/word/2010/wordprocessingInk" xmlns:wne="http://schemas.microsoft.com/office/word/2006/wordml" xmlns:wps="http://schemas.microsoft.com/office/word/2010/wordprocessingShape" mc:Ignorable="w14 w15 w16se w16cid w16 w16cex w16sdtdh wp14">
+<w:numbering xmlns:wpc="http://schemas.microsoft.com/office/word/2010/wordprocessingCanvas" xmlns:cx="http://schemas.microsoft.com/office/drawing/2014/chartex" xmlns:cx1="http://schemas.microsoft.com/office/drawing/2015/9/8/chartex" xmlns:cx2="http://schemas.microsoft.com/office/drawing/2015/10/21/chartex" xmlns:cx3="http://schemas.microsoft.com/office/drawing/2016/5/9/chartex" xmlns:cx4="http://schemas.microsoft.com/office/drawing/2016/5/10/chartex" xmlns:cx5="http://schemas.microsoft.com/office/drawing/2016/5/11/chartex" xmlns:cx6="http://schemas.microsoft.com/office/drawing/2016/5/12/chartex" xmlns:cx7="http://schemas.microsoft.com/office/drawing/2016/5/13/chartex" xmlns:cx8="http://schemas.microsoft.com/office/drawing/2016/5/14/chartex" xmlns:mc="http://schemas.openxmlformats.org/markup-compatibility/2006" xmlns:aink="http://schemas.microsoft.com/office/drawing/2016/ink" xmlns:am3d="http://schemas.microsoft.com/office/drawing/2017/model3d" xmlns:o="urn:schemas-microsoft-com:office:office" xmlns:oel="http://schemas.microsoft.com/office/2019/extlst" xmlns:r="http://schemas.openxmlformats.org/officeDocument/2006/relationships" xmlns:m="http://schemas.openxmlformats.org/officeDocument/2006/math" xmlns:v="urn:schemas-microsoft-com:vml" xmlns:wp14="http://schemas.microsoft.com/office/word/2010/wordprocessingDrawing" xmlns:wp="http://schemas.openxmlformats.org/drawingml/2006/wordprocessingDrawing" xmlns:w10="urn:schemas-microsoft-com:office:word" xmlns:w="http://schemas.openxmlformats.org/wordprocessingml/2006/main" xmlns:w14="http://schemas.microsoft.com/office/word/2010/wordml" xmlns:w15="http://schemas.microsoft.com/office/word/2012/wordml" xmlns:w16cex="http://schemas.microsoft.com/office/word/2018/wordml/cex" xmlns:w16cid="http://schemas.microsoft.com/office/word/2016/wordml/cid" xmlns:w16="http://schemas.microsoft.com/office/word/2018/wordml" xmlns:w16du="http://schemas.microsoft.com/office/word/2023/wordml/word16du" xmlns:w16sdtdh="http://schemas.microsoft.com/office/word/2020/wordml/sdtdatahash" xmlns:w16sdtfl="http://schemas.microsoft.com/office/word/2024/wordml/sdtformatlock" xmlns:w16se="http://schemas.microsoft.com/office/word/2015/wordml/symex" xmlns:wpg="http://schemas.microsoft.com/office/word/2010/wordprocessingGroup" xmlns:wpi="http://schemas.microsoft.com/office/word/2010/wordprocessingInk" xmlns:wne="http://schemas.microsoft.com/office/word/2006/wordml" xmlns:wps="http://schemas.microsoft.com/office/word/2010/wordprocessingShape" mc:Ignorable="w14 w15 w16se w16cid w16 w16cex w16sdtdh w16sdtfl w16du wp14">
   <w:abstractNum w:abstractNumId="0" w15:restartNumberingAfterBreak="0">
     <w:nsid w:val="011C4F4D"/>
     <w:multiLevelType w:val="hybridMultilevel"/>
@@ -3945,6 +5267,95 @@
     </w:lvl>
   </w:abstractNum>
   <w:abstractNum w:abstractNumId="7" w15:restartNumberingAfterBreak="0">
+    <w:nsid w:val="6D9778FC"/>
+    <w:multiLevelType w:val="hybridMultilevel"/>
+    <w:tmpl w:val="3174B0C6"/>
+    <w:lvl w:ilvl="0" w:tplc="0409000F">
+      <w:start w:val="1"/>
+      <w:numFmt w:val="decimal"/>
+      <w:lvlText w:val="%1."/>
+      <w:lvlJc w:val="left"/>
+      <w:pPr>
+        <w:ind w:left="720" w:hanging="360"/>
+      </w:pPr>
+      <w:rPr>
+        <w:rFonts w:hint="default"/>
+      </w:rPr>
+    </w:lvl>
+    <w:lvl w:ilvl="1" w:tplc="04090019" w:tentative="1">
+      <w:start w:val="1"/>
+      <w:numFmt w:val="lowerLetter"/>
+      <w:lvlText w:val="%2."/>
+      <w:lvlJc w:val="left"/>
+      <w:pPr>
+        <w:ind w:left="1440" w:hanging="360"/>
+      </w:pPr>
+    </w:lvl>
+    <w:lvl w:ilvl="2" w:tplc="0409001B" w:tentative="1">
+      <w:start w:val="1"/>
+      <w:numFmt w:val="lowerRoman"/>
+      <w:lvlText w:val="%3."/>
+      <w:lvlJc w:val="right"/>
+      <w:pPr>
+        <w:ind w:left="2160" w:hanging="180"/>
+      </w:pPr>
+    </w:lvl>
+    <w:lvl w:ilvl="3" w:tplc="0409000F" w:tentative="1">
+      <w:start w:val="1"/>
+      <w:numFmt w:val="decimal"/>
+      <w:lvlText w:val="%4."/>
+      <w:lvlJc w:val="left"/>
+      <w:pPr>
+        <w:ind w:left="2880" w:hanging="360"/>
+      </w:pPr>
+    </w:lvl>
+    <w:lvl w:ilvl="4" w:tplc="04090019" w:tentative="1">
+      <w:start w:val="1"/>
+      <w:numFmt w:val="lowerLetter"/>
+      <w:lvlText w:val="%5."/>
+      <w:lvlJc w:val="left"/>
+      <w:pPr>
+        <w:ind w:left="3600" w:hanging="360"/>
+      </w:pPr>
+    </w:lvl>
+    <w:lvl w:ilvl="5" w:tplc="0409001B" w:tentative="1">
+      <w:start w:val="1"/>
+      <w:numFmt w:val="lowerRoman"/>
+      <w:lvlText w:val="%6."/>
+      <w:lvlJc w:val="right"/>
+      <w:pPr>
+        <w:ind w:left="4320" w:hanging="180"/>
+      </w:pPr>
+    </w:lvl>
+    <w:lvl w:ilvl="6" w:tplc="0409000F" w:tentative="1">
+      <w:start w:val="1"/>
+      <w:numFmt w:val="decimal"/>
+      <w:lvlText w:val="%7."/>
+      <w:lvlJc w:val="left"/>
+      <w:pPr>
+        <w:ind w:left="5040" w:hanging="360"/>
+      </w:pPr>
+    </w:lvl>
+    <w:lvl w:ilvl="7" w:tplc="04090019" w:tentative="1">
+      <w:start w:val="1"/>
+      <w:numFmt w:val="lowerLetter"/>
+      <w:lvlText w:val="%8."/>
+      <w:lvlJc w:val="left"/>
+      <w:pPr>
+        <w:ind w:left="5760" w:hanging="360"/>
+      </w:pPr>
+    </w:lvl>
+    <w:lvl w:ilvl="8" w:tplc="0409001B" w:tentative="1">
+      <w:start w:val="1"/>
+      <w:numFmt w:val="lowerRoman"/>
+      <w:lvlText w:val="%9."/>
+      <w:lvlJc w:val="right"/>
+      <w:pPr>
+        <w:ind w:left="6480" w:hanging="180"/>
+      </w:pPr>
+    </w:lvl>
+  </w:abstractNum>
+  <w:abstractNum w:abstractNumId="8" w15:restartNumberingAfterBreak="0">
     <w:nsid w:val="6E6F78FF"/>
     <w:multiLevelType w:val="hybridMultilevel"/>
     <w:tmpl w:val="6A8876F4"/>
@@ -4040,7 +5451,7 @@
     <w:abstractNumId w:val="0"/>
   </w:num>
   <w:num w:numId="3" w16cid:durableId="1035622409">
-    <w:abstractNumId w:val="7"/>
+    <w:abstractNumId w:val="8"/>
   </w:num>
   <w:num w:numId="4" w16cid:durableId="269432654">
     <w:abstractNumId w:val="6"/>
@@ -4057,11 +5468,14 @@
   <w:num w:numId="8" w16cid:durableId="359746283">
     <w:abstractNumId w:val="5"/>
   </w:num>
+  <w:num w:numId="9" w16cid:durableId="420180109">
+    <w:abstractNumId w:val="7"/>
+  </w:num>
 </w:numbering>
 </file>
 
 <file path=word/styles.xml><?xml version="1.0" encoding="utf-8"?>
-<w:styles xmlns:mc="http://schemas.openxmlformats.org/markup-compatibility/2006" xmlns:r="http://schemas.openxmlformats.org/officeDocument/2006/relationships" xmlns:w="http://schemas.openxmlformats.org/wordprocessingml/2006/main" xmlns:w14="http://schemas.microsoft.com/office/word/2010/wordml" xmlns:w15="http://schemas.microsoft.com/office/word/2012/wordml" xmlns:w16cex="http://schemas.microsoft.com/office/word/2018/wordml/cex" xmlns:w16cid="http://schemas.microsoft.com/office/word/2016/wordml/cid" xmlns:w16="http://schemas.microsoft.com/office/word/2018/wordml" xmlns:w16sdtdh="http://schemas.microsoft.com/office/word/2020/wordml/sdtdatahash" xmlns:w16se="http://schemas.microsoft.com/office/word/2015/wordml/symex" mc:Ignorable="w14 w15 w16se w16cid w16 w16cex w16sdtdh">
+<w:styles xmlns:mc="http://schemas.openxmlformats.org/markup-compatibility/2006" xmlns:r="http://schemas.openxmlformats.org/officeDocument/2006/relationships" xmlns:w="http://schemas.openxmlformats.org/wordprocessingml/2006/main" xmlns:w14="http://schemas.microsoft.com/office/word/2010/wordml" xmlns:w15="http://schemas.microsoft.com/office/word/2012/wordml" xmlns:w16cex="http://schemas.microsoft.com/office/word/2018/wordml/cex" xmlns:w16cid="http://schemas.microsoft.com/office/word/2016/wordml/cid" xmlns:w16="http://schemas.microsoft.com/office/word/2018/wordml" xmlns:w16du="http://schemas.microsoft.com/office/word/2023/wordml/word16du" xmlns:w16sdtdh="http://schemas.microsoft.com/office/word/2020/wordml/sdtdatahash" xmlns:w16sdtfl="http://schemas.microsoft.com/office/word/2024/wordml/sdtformatlock" xmlns:w16se="http://schemas.microsoft.com/office/word/2015/wordml/symex" mc:Ignorable="w14 w15 w16se w16cid w16 w16cex w16sdtdh w16sdtfl w16du">
   <w:docDefaults>
     <w:rPrDefault>
       <w:rPr>
@@ -4759,6 +6173,25 @@
       <w:szCs w:val="18"/>
     </w:rPr>
   </w:style>
+  <w:style w:type="table" w:styleId="TableGrid">
+    <w:name w:val="Table Grid"/>
+    <w:basedOn w:val="TableNormal"/>
+    <w:uiPriority w:val="39"/>
+    <w:rsid w:val="00F37140"/>
+    <w:pPr>
+      <w:spacing w:after="0" w:line="240" w:lineRule="auto"/>
+    </w:pPr>
+    <w:tblPr>
+      <w:tblBorders>
+        <w:top w:val="single" w:sz="4" w:space="0" w:color="auto"/>
+        <w:left w:val="single" w:sz="4" w:space="0" w:color="auto"/>
+        <w:bottom w:val="single" w:sz="4" w:space="0" w:color="auto"/>
+        <w:right w:val="single" w:sz="4" w:space="0" w:color="auto"/>
+        <w:insideH w:val="single" w:sz="4" w:space="0" w:color="auto"/>
+        <w:insideV w:val="single" w:sz="4" w:space="0" w:color="auto"/>
+      </w:tblBorders>
+    </w:tblPr>
+  </w:style>
 </w:styles>
 </file>
 

</xml_diff>